<commit_message>
review screens, instructions template, initial testing
</commit_message>
<xml_diff>
--- a/docassemble/MinorGuardianshipDischarge/data/templates/guardianship_discharge_petition.docx
+++ b/docassemble/MinorGuardianshipDischarge/data/templates/guardianship_discharge_petition.docx
@@ -20,7 +20,27 @@
           <w:sz w:val="24"/>
           <w:szCs w:val="24"/>
         </w:rPr>
-        <w:t>{% if trial_court_index == -1 %}</w:t>
+        <w:t xml:space="preserve">{% if </w:t>
+      </w:r>
+      <w:proofErr w:type="spellStart"/>
+      <w:r>
+        <w:rPr>
+          <w:rFonts w:ascii="Times New Roman" w:hAnsi="Times New Roman"/>
+          <w:b/>
+          <w:sz w:val="24"/>
+          <w:szCs w:val="24"/>
+        </w:rPr>
+        <w:t>trial_court_index</w:t>
+      </w:r>
+      <w:proofErr w:type="spellEnd"/>
+      <w:r>
+        <w:rPr>
+          <w:rFonts w:ascii="Times New Roman" w:hAnsi="Times New Roman"/>
+          <w:b/>
+          <w:sz w:val="24"/>
+          <w:szCs w:val="24"/>
+        </w:rPr>
+        <w:t xml:space="preserve"> == -1 %}</w:t>
       </w:r>
     </w:p>
     <w:p>
@@ -124,16 +144,36 @@
           <w:sz w:val="24"/>
           <w:szCs w:val="24"/>
         </w:rPr>
-        <w:t>{{ judicial_district_ordinal</w:t>
-      </w:r>
-      <w:r>
-        <w:rPr>
-          <w:rFonts w:ascii="Times New Roman" w:hAnsi="Times New Roman"/>
-          <w:b/>
-          <w:sz w:val="24"/>
-          <w:szCs w:val="24"/>
-        </w:rPr>
-        <w:t>.upper()</w:t>
+        <w:t xml:space="preserve">{{ </w:t>
+      </w:r>
+      <w:proofErr w:type="spellStart"/>
+      <w:r>
+        <w:rPr>
+          <w:rFonts w:ascii="Times New Roman" w:hAnsi="Times New Roman"/>
+          <w:b/>
+          <w:sz w:val="24"/>
+          <w:szCs w:val="24"/>
+        </w:rPr>
+        <w:t>judicial_district_ordinal</w:t>
+      </w:r>
+      <w:r>
+        <w:rPr>
+          <w:rFonts w:ascii="Times New Roman" w:hAnsi="Times New Roman"/>
+          <w:b/>
+          <w:sz w:val="24"/>
+          <w:szCs w:val="24"/>
+        </w:rPr>
+        <w:t>.upper</w:t>
+      </w:r>
+      <w:proofErr w:type="spellEnd"/>
+      <w:r>
+        <w:rPr>
+          <w:rFonts w:ascii="Times New Roman" w:hAnsi="Times New Roman"/>
+          <w:b/>
+          <w:sz w:val="24"/>
+          <w:szCs w:val="24"/>
+        </w:rPr>
+        <w:t>()</w:t>
       </w:r>
       <w:r>
         <w:rPr>
@@ -173,16 +213,36 @@
           <w:sz w:val="24"/>
           <w:szCs w:val="24"/>
         </w:rPr>
-        <w:t>{{trial_court.address.county</w:t>
-      </w:r>
-      <w:r>
-        <w:rPr>
-          <w:rFonts w:ascii="Times New Roman" w:hAnsi="Times New Roman"/>
-          <w:b/>
-          <w:sz w:val="24"/>
-          <w:szCs w:val="24"/>
-        </w:rPr>
-        <w:t>.upper()</w:t>
+        <w:t>{{</w:t>
+      </w:r>
+      <w:proofErr w:type="spellStart"/>
+      <w:r>
+        <w:rPr>
+          <w:rFonts w:ascii="Times New Roman" w:hAnsi="Times New Roman"/>
+          <w:b/>
+          <w:sz w:val="24"/>
+          <w:szCs w:val="24"/>
+        </w:rPr>
+        <w:t>trial_court.address.county</w:t>
+      </w:r>
+      <w:r>
+        <w:rPr>
+          <w:rFonts w:ascii="Times New Roman" w:hAnsi="Times New Roman"/>
+          <w:b/>
+          <w:sz w:val="24"/>
+          <w:szCs w:val="24"/>
+        </w:rPr>
+        <w:t>.upper</w:t>
+      </w:r>
+      <w:proofErr w:type="spellEnd"/>
+      <w:r>
+        <w:rPr>
+          <w:rFonts w:ascii="Times New Roman" w:hAnsi="Times New Roman"/>
+          <w:b/>
+          <w:sz w:val="24"/>
+          <w:szCs w:val="24"/>
+        </w:rPr>
+        <w:t>()</w:t>
       </w:r>
       <w:r>
         <w:rPr>
@@ -264,7 +324,47 @@
           <w:sz w:val="24"/>
           <w:szCs w:val="24"/>
         </w:rPr>
-        <w:t>{% if case_number != “” %}{{case_number}}{% else %}</w:t>
+        <w:t xml:space="preserve">{% if </w:t>
+      </w:r>
+      <w:proofErr w:type="spellStart"/>
+      <w:r>
+        <w:rPr>
+          <w:rFonts w:ascii="Times New Roman" w:hAnsi="Times New Roman"/>
+          <w:color w:val="000000"/>
+          <w:sz w:val="24"/>
+          <w:szCs w:val="24"/>
+        </w:rPr>
+        <w:t>case_number</w:t>
+      </w:r>
+      <w:proofErr w:type="spellEnd"/>
+      <w:r>
+        <w:rPr>
+          <w:rFonts w:ascii="Times New Roman" w:hAnsi="Times New Roman"/>
+          <w:color w:val="000000"/>
+          <w:sz w:val="24"/>
+          <w:szCs w:val="24"/>
+        </w:rPr>
+        <w:t xml:space="preserve"> != “” %}{{</w:t>
+      </w:r>
+      <w:proofErr w:type="spellStart"/>
+      <w:r>
+        <w:rPr>
+          <w:rFonts w:ascii="Times New Roman" w:hAnsi="Times New Roman"/>
+          <w:color w:val="000000"/>
+          <w:sz w:val="24"/>
+          <w:szCs w:val="24"/>
+        </w:rPr>
+        <w:t>case_number</w:t>
+      </w:r>
+      <w:proofErr w:type="spellEnd"/>
+      <w:r>
+        <w:rPr>
+          <w:rFonts w:ascii="Times New Roman" w:hAnsi="Times New Roman"/>
+          <w:color w:val="000000"/>
+          <w:sz w:val="24"/>
+          <w:szCs w:val="24"/>
+        </w:rPr>
+        <w:t>}}{% else %}</w:t>
       </w:r>
       <w:r>
         <w:rPr>
@@ -343,7 +443,27 @@
           <w:szCs w:val="24"/>
           <w:u w:val="single"/>
         </w:rPr>
-        <w:t>{{child.name_full()}}</w:t>
+        <w:t>{{</w:t>
+      </w:r>
+      <w:proofErr w:type="spellStart"/>
+      <w:r>
+        <w:rPr>
+          <w:rFonts w:ascii="Times New Roman" w:hAnsi="Times New Roman"/>
+          <w:sz w:val="24"/>
+          <w:szCs w:val="24"/>
+          <w:u w:val="single"/>
+        </w:rPr>
+        <w:t>child.name_full</w:t>
+      </w:r>
+      <w:proofErr w:type="spellEnd"/>
+      <w:r>
+        <w:rPr>
+          <w:rFonts w:ascii="Times New Roman" w:hAnsi="Times New Roman"/>
+          <w:sz w:val="24"/>
+          <w:szCs w:val="24"/>
+          <w:u w:val="single"/>
+        </w:rPr>
+        <w:t>()}}</w:t>
       </w:r>
       <w:r>
         <w:rPr>
@@ -446,7 +566,33 @@
           <w:sz w:val="24"/>
           <w:szCs w:val="24"/>
         </w:rPr>
-        <w:t>{{users[0].name_full()}}</w:t>
+        <w:t>{{users[0].</w:t>
+      </w:r>
+      <w:proofErr w:type="spellStart"/>
+      <w:r>
+        <w:rPr>
+          <w:rFonts w:ascii="Times New Roman" w:hAnsi="Times New Roman"/>
+          <w:sz w:val="24"/>
+          <w:szCs w:val="24"/>
+        </w:rPr>
+        <w:t>name_full</w:t>
+      </w:r>
+      <w:proofErr w:type="spellEnd"/>
+      <w:r>
+        <w:rPr>
+          <w:rFonts w:ascii="Times New Roman" w:hAnsi="Times New Roman"/>
+          <w:sz w:val="24"/>
+          <w:szCs w:val="24"/>
+        </w:rPr>
+        <w:t>()}}</w:t>
+      </w:r>
+      <w:r>
+        <w:rPr>
+          <w:rFonts w:ascii="Times New Roman" w:hAnsi="Times New Roman"/>
+          <w:sz w:val="24"/>
+          <w:szCs w:val="24"/>
+        </w:rPr>
+        <w:t>,</w:t>
       </w:r>
       <w:r>
         <w:rPr>
@@ -527,7 +673,25 @@
           <w:sz w:val="24"/>
           <w:szCs w:val="24"/>
         </w:rPr>
-        <w:t>{{child.name_full()}}</w:t>
+        <w:t>{{</w:t>
+      </w:r>
+      <w:proofErr w:type="spellStart"/>
+      <w:r>
+        <w:rPr>
+          <w:rFonts w:ascii="Times New Roman" w:hAnsi="Times New Roman"/>
+          <w:sz w:val="24"/>
+          <w:szCs w:val="24"/>
+        </w:rPr>
+        <w:t>child.name_full</w:t>
+      </w:r>
+      <w:proofErr w:type="spellEnd"/>
+      <w:r>
+        <w:rPr>
+          <w:rFonts w:ascii="Times New Roman" w:hAnsi="Times New Roman"/>
+          <w:sz w:val="24"/>
+          <w:szCs w:val="24"/>
+        </w:rPr>
+        <w:t>()}}</w:t>
       </w:r>
       <w:r>
         <w:rPr>
@@ -562,21 +726,49 @@
         </w:rPr>
         <w:t>{{</w:t>
       </w:r>
-      <w:r>
-        <w:rPr>
-          <w:rFonts w:ascii="Times New Roman" w:hAnsi="Times New Roman"/>
-          <w:sz w:val="24"/>
-          <w:szCs w:val="24"/>
-        </w:rPr>
-        <w:t>other_parties[0]</w:t>
-      </w:r>
-      <w:r>
-        <w:rPr>
-          <w:rFonts w:ascii="Times New Roman" w:hAnsi="Times New Roman"/>
-          <w:sz w:val="24"/>
-          <w:szCs w:val="24"/>
-        </w:rPr>
-        <w:t>.name_full()}}</w:t>
+      <w:proofErr w:type="spellStart"/>
+      <w:r>
+        <w:rPr>
+          <w:rFonts w:ascii="Times New Roman" w:hAnsi="Times New Roman"/>
+          <w:sz w:val="24"/>
+          <w:szCs w:val="24"/>
+        </w:rPr>
+        <w:t>other_parties</w:t>
+      </w:r>
+      <w:proofErr w:type="spellEnd"/>
+      <w:r>
+        <w:rPr>
+          <w:rFonts w:ascii="Times New Roman" w:hAnsi="Times New Roman"/>
+          <w:sz w:val="24"/>
+          <w:szCs w:val="24"/>
+        </w:rPr>
+        <w:t>[0]</w:t>
+      </w:r>
+      <w:r>
+        <w:rPr>
+          <w:rFonts w:ascii="Times New Roman" w:hAnsi="Times New Roman"/>
+          <w:sz w:val="24"/>
+          <w:szCs w:val="24"/>
+        </w:rPr>
+        <w:t>.</w:t>
+      </w:r>
+      <w:proofErr w:type="spellStart"/>
+      <w:r>
+        <w:rPr>
+          <w:rFonts w:ascii="Times New Roman" w:hAnsi="Times New Roman"/>
+          <w:sz w:val="24"/>
+          <w:szCs w:val="24"/>
+        </w:rPr>
+        <w:t>name_full</w:t>
+      </w:r>
+      <w:proofErr w:type="spellEnd"/>
+      <w:r>
+        <w:rPr>
+          <w:rFonts w:ascii="Times New Roman" w:hAnsi="Times New Roman"/>
+          <w:sz w:val="24"/>
+          <w:szCs w:val="24"/>
+        </w:rPr>
+        <w:t>()}}</w:t>
       </w:r>
       <w:r>
         <w:rPr>
@@ -600,7 +792,25 @@
           <w:sz w:val="24"/>
           <w:szCs w:val="24"/>
         </w:rPr>
-        <w:t>{{child.name_full()}}</w:t>
+        <w:t>{{</w:t>
+      </w:r>
+      <w:proofErr w:type="spellStart"/>
+      <w:r>
+        <w:rPr>
+          <w:rFonts w:ascii="Times New Roman" w:hAnsi="Times New Roman"/>
+          <w:sz w:val="24"/>
+          <w:szCs w:val="24"/>
+        </w:rPr>
+        <w:t>child.name_full</w:t>
+      </w:r>
+      <w:proofErr w:type="spellEnd"/>
+      <w:r>
+        <w:rPr>
+          <w:rFonts w:ascii="Times New Roman" w:hAnsi="Times New Roman"/>
+          <w:sz w:val="24"/>
+          <w:szCs w:val="24"/>
+        </w:rPr>
+        <w:t>()}}</w:t>
       </w:r>
       <w:r>
         <w:rPr>
@@ -624,7 +834,25 @@
           <w:sz w:val="24"/>
           <w:szCs w:val="24"/>
         </w:rPr>
-        <w:t>{{original_court.address.county}}</w:t>
+        <w:t>{{</w:t>
+      </w:r>
+      <w:proofErr w:type="spellStart"/>
+      <w:r>
+        <w:rPr>
+          <w:rFonts w:ascii="Times New Roman" w:hAnsi="Times New Roman"/>
+          <w:sz w:val="24"/>
+          <w:szCs w:val="24"/>
+        </w:rPr>
+        <w:t>original_court.address.county</w:t>
+      </w:r>
+      <w:proofErr w:type="spellEnd"/>
+      <w:r>
+        <w:rPr>
+          <w:rFonts w:ascii="Times New Roman" w:hAnsi="Times New Roman"/>
+          <w:sz w:val="24"/>
+          <w:szCs w:val="24"/>
+        </w:rPr>
+        <w:t>}}</w:t>
       </w:r>
       <w:r>
         <w:rPr>
@@ -648,7 +876,25 @@
           <w:sz w:val="24"/>
           <w:szCs w:val="24"/>
         </w:rPr>
-        <w:t>{{guardianship_date}}</w:t>
+        <w:t>{{</w:t>
+      </w:r>
+      <w:proofErr w:type="spellStart"/>
+      <w:r>
+        <w:rPr>
+          <w:rFonts w:ascii="Times New Roman" w:hAnsi="Times New Roman"/>
+          <w:sz w:val="24"/>
+          <w:szCs w:val="24"/>
+        </w:rPr>
+        <w:t>guardianship_date</w:t>
+      </w:r>
+      <w:proofErr w:type="spellEnd"/>
+      <w:r>
+        <w:rPr>
+          <w:rFonts w:ascii="Times New Roman" w:hAnsi="Times New Roman"/>
+          <w:sz w:val="24"/>
+          <w:szCs w:val="24"/>
+        </w:rPr>
+        <w:t>}}</w:t>
       </w:r>
       <w:r>
         <w:rPr>
@@ -705,7 +951,43 @@
           <w:sz w:val="24"/>
           <w:szCs w:val="24"/>
         </w:rPr>
-        <w:t>{{fix_punctuation(live_with_parties.full_names()</w:t>
+        <w:t>{{</w:t>
+      </w:r>
+      <w:proofErr w:type="spellStart"/>
+      <w:r>
+        <w:rPr>
+          <w:rFonts w:ascii="Times New Roman" w:hAnsi="Times New Roman"/>
+          <w:sz w:val="24"/>
+          <w:szCs w:val="24"/>
+        </w:rPr>
+        <w:t>fix_punctuation</w:t>
+      </w:r>
+      <w:proofErr w:type="spellEnd"/>
+      <w:r>
+        <w:rPr>
+          <w:rFonts w:ascii="Times New Roman" w:hAnsi="Times New Roman"/>
+          <w:sz w:val="24"/>
+          <w:szCs w:val="24"/>
+        </w:rPr>
+        <w:t>(</w:t>
+      </w:r>
+      <w:proofErr w:type="spellStart"/>
+      <w:r>
+        <w:rPr>
+          <w:rFonts w:ascii="Times New Roman" w:hAnsi="Times New Roman"/>
+          <w:sz w:val="24"/>
+          <w:szCs w:val="24"/>
+        </w:rPr>
+        <w:t>live_with_parties.full_names</w:t>
+      </w:r>
+      <w:proofErr w:type="spellEnd"/>
+      <w:r>
+        <w:rPr>
+          <w:rFonts w:ascii="Times New Roman" w:hAnsi="Times New Roman"/>
+          <w:sz w:val="24"/>
+          <w:szCs w:val="24"/>
+        </w:rPr>
+        <w:t>()</w:t>
       </w:r>
       <w:r>
         <w:rPr>
@@ -786,13 +1068,47 @@
         <w:rPr>
           <w:rFonts w:ascii="Times New Roman" w:hAnsi="Times New Roman"/>
         </w:rPr>
-        <w:t>{{why_started}}</w:t>
-      </w:r>
-      <w:r>
-        <w:rPr>
-          <w:rFonts w:ascii="Times New Roman" w:hAnsi="Times New Roman"/>
-        </w:rPr>
-        <w:t>.</w:t>
+        <w:t>{{</w:t>
+      </w:r>
+      <w:proofErr w:type="spellStart"/>
+      <w:r>
+        <w:rPr>
+          <w:rFonts w:ascii="Times New Roman" w:hAnsi="Times New Roman"/>
+        </w:rPr>
+        <w:t>fix_</w:t>
+      </w:r>
+      <w:r>
+        <w:rPr>
+          <w:rFonts w:ascii="Times New Roman" w:hAnsi="Times New Roman"/>
+        </w:rPr>
+        <w:t>punctuation</w:t>
+      </w:r>
+      <w:proofErr w:type="spellEnd"/>
+      <w:r>
+        <w:rPr>
+          <w:rFonts w:ascii="Times New Roman" w:hAnsi="Times New Roman"/>
+        </w:rPr>
+        <w:t>(</w:t>
+      </w:r>
+      <w:proofErr w:type="spellStart"/>
+      <w:r>
+        <w:rPr>
+          <w:rFonts w:ascii="Times New Roman" w:hAnsi="Times New Roman"/>
+        </w:rPr>
+        <w:t>why_started</w:t>
+      </w:r>
+      <w:proofErr w:type="spellEnd"/>
+      <w:r>
+        <w:rPr>
+          <w:rFonts w:ascii="Times New Roman" w:hAnsi="Times New Roman"/>
+        </w:rPr>
+        <w:t>)</w:t>
+      </w:r>
+      <w:r>
+        <w:rPr>
+          <w:rFonts w:ascii="Times New Roman" w:hAnsi="Times New Roman"/>
+        </w:rPr>
+        <w:t>}}</w:t>
       </w:r>
     </w:p>
     <w:p>
@@ -816,11 +1132,90 @@
         <w:rPr>
           <w:rFonts w:ascii="Times New Roman" w:hAnsi="Times New Roman"/>
         </w:rPr>
-        <w:t>{{why_end}}</w:t>
-      </w:r>
-      <w:r>
-        <w:rPr>
-          <w:rFonts w:ascii="Times New Roman" w:hAnsi="Times New Roman"/>
+        <w:t>{{</w:t>
+      </w:r>
+      <w:proofErr w:type="spellStart"/>
+      <w:r>
+        <w:rPr>
+          <w:rFonts w:ascii="Times New Roman" w:hAnsi="Times New Roman"/>
+        </w:rPr>
+        <w:t>fix_punctuation</w:t>
+      </w:r>
+      <w:proofErr w:type="spellEnd"/>
+      <w:r>
+        <w:rPr>
+          <w:rFonts w:ascii="Times New Roman" w:hAnsi="Times New Roman"/>
+        </w:rPr>
+        <w:t>(</w:t>
+      </w:r>
+      <w:proofErr w:type="spellStart"/>
+      <w:r>
+        <w:rPr>
+          <w:rFonts w:ascii="Times New Roman" w:hAnsi="Times New Roman"/>
+        </w:rPr>
+        <w:t>why_end</w:t>
+      </w:r>
+      <w:proofErr w:type="spellEnd"/>
+      <w:r>
+        <w:rPr>
+          <w:rFonts w:ascii="Times New Roman" w:hAnsi="Times New Roman"/>
+        </w:rPr>
+        <w:t>)</w:t>
+      </w:r>
+      <w:r>
+        <w:rPr>
+          <w:rFonts w:ascii="Times New Roman" w:hAnsi="Times New Roman"/>
+        </w:rPr>
+        <w:t>}}</w:t>
+      </w:r>
+    </w:p>
+    <w:p>
+      <w:pPr>
+        <w:rPr>
+          <w:rFonts w:ascii="Times New Roman" w:hAnsi="Times New Roman"/>
+          <w:sz w:val="24"/>
+          <w:szCs w:val="24"/>
+        </w:rPr>
+      </w:pPr>
+      <w:r>
+        <w:rPr>
+          <w:rFonts w:ascii="Times New Roman" w:hAnsi="Times New Roman"/>
+          <w:sz w:val="24"/>
+          <w:szCs w:val="24"/>
+        </w:rPr>
+        <w:t xml:space="preserve">5. I am willing and able to resume care and custody of </w:t>
+      </w:r>
+      <w:r>
+        <w:rPr>
+          <w:rFonts w:ascii="Times New Roman" w:hAnsi="Times New Roman"/>
+          <w:sz w:val="24"/>
+          <w:szCs w:val="24"/>
+        </w:rPr>
+        <w:t>{{</w:t>
+      </w:r>
+      <w:proofErr w:type="spellStart"/>
+      <w:r>
+        <w:rPr>
+          <w:rFonts w:ascii="Times New Roman" w:hAnsi="Times New Roman"/>
+          <w:sz w:val="24"/>
+          <w:szCs w:val="24"/>
+        </w:rPr>
+        <w:t>child.name_full</w:t>
+      </w:r>
+      <w:proofErr w:type="spellEnd"/>
+      <w:r>
+        <w:rPr>
+          <w:rFonts w:ascii="Times New Roman" w:hAnsi="Times New Roman"/>
+          <w:sz w:val="24"/>
+          <w:szCs w:val="24"/>
+        </w:rPr>
+        <w:t>()}}</w:t>
+      </w:r>
+      <w:r>
+        <w:rPr>
+          <w:rFonts w:ascii="Times New Roman" w:hAnsi="Times New Roman"/>
+          <w:sz w:val="24"/>
+          <w:szCs w:val="24"/>
         </w:rPr>
         <w:t>.</w:t>
       </w:r>
@@ -839,39 +1234,6 @@
           <w:sz w:val="24"/>
           <w:szCs w:val="24"/>
         </w:rPr>
-        <w:t xml:space="preserve">5. I am willing and able to resume care and custody of </w:t>
-      </w:r>
-      <w:r>
-        <w:rPr>
-          <w:rFonts w:ascii="Times New Roman" w:hAnsi="Times New Roman"/>
-          <w:sz w:val="24"/>
-          <w:szCs w:val="24"/>
-        </w:rPr>
-        <w:t>{{child.name_full()}}</w:t>
-      </w:r>
-      <w:r>
-        <w:rPr>
-          <w:rFonts w:ascii="Times New Roman" w:hAnsi="Times New Roman"/>
-          <w:sz w:val="24"/>
-          <w:szCs w:val="24"/>
-        </w:rPr>
-        <w:t>.</w:t>
-      </w:r>
-    </w:p>
-    <w:p>
-      <w:pPr>
-        <w:rPr>
-          <w:rFonts w:ascii="Times New Roman" w:hAnsi="Times New Roman"/>
-          <w:sz w:val="24"/>
-          <w:szCs w:val="24"/>
-        </w:rPr>
-      </w:pPr>
-      <w:r>
-        <w:rPr>
-          <w:rFonts w:ascii="Times New Roman" w:hAnsi="Times New Roman"/>
-          <w:sz w:val="24"/>
-          <w:szCs w:val="24"/>
-        </w:rPr>
         <w:t xml:space="preserve">WHEREFORE, I pray that </w:t>
       </w:r>
       <w:r>
@@ -880,7 +1242,43 @@
           <w:sz w:val="24"/>
           <w:szCs w:val="24"/>
         </w:rPr>
-        <w:t>{{other_parties[0].name_full()}}</w:t>
+        <w:t>{{</w:t>
+      </w:r>
+      <w:proofErr w:type="spellStart"/>
+      <w:r>
+        <w:rPr>
+          <w:rFonts w:ascii="Times New Roman" w:hAnsi="Times New Roman"/>
+          <w:sz w:val="24"/>
+          <w:szCs w:val="24"/>
+        </w:rPr>
+        <w:t>other_parties</w:t>
+      </w:r>
+      <w:proofErr w:type="spellEnd"/>
+      <w:r>
+        <w:rPr>
+          <w:rFonts w:ascii="Times New Roman" w:hAnsi="Times New Roman"/>
+          <w:sz w:val="24"/>
+          <w:szCs w:val="24"/>
+        </w:rPr>
+        <w:t>[0].</w:t>
+      </w:r>
+      <w:proofErr w:type="spellStart"/>
+      <w:r>
+        <w:rPr>
+          <w:rFonts w:ascii="Times New Roman" w:hAnsi="Times New Roman"/>
+          <w:sz w:val="24"/>
+          <w:szCs w:val="24"/>
+        </w:rPr>
+        <w:t>name_full</w:t>
+      </w:r>
+      <w:proofErr w:type="spellEnd"/>
+      <w:r>
+        <w:rPr>
+          <w:rFonts w:ascii="Times New Roman" w:hAnsi="Times New Roman"/>
+          <w:sz w:val="24"/>
+          <w:szCs w:val="24"/>
+        </w:rPr>
+        <w:t>()}}</w:t>
       </w:r>
       <w:r>
         <w:rPr>
@@ -904,7 +1302,25 @@
           <w:sz w:val="24"/>
           <w:szCs w:val="24"/>
         </w:rPr>
-        <w:t>{{child.name_full()}}</w:t>
+        <w:t>{{</w:t>
+      </w:r>
+      <w:proofErr w:type="spellStart"/>
+      <w:r>
+        <w:rPr>
+          <w:rFonts w:ascii="Times New Roman" w:hAnsi="Times New Roman"/>
+          <w:sz w:val="24"/>
+          <w:szCs w:val="24"/>
+        </w:rPr>
+        <w:t>child.name_full</w:t>
+      </w:r>
+      <w:proofErr w:type="spellEnd"/>
+      <w:r>
+        <w:rPr>
+          <w:rFonts w:ascii="Times New Roman" w:hAnsi="Times New Roman"/>
+          <w:sz w:val="24"/>
+          <w:szCs w:val="24"/>
+        </w:rPr>
+        <w:t>()}}</w:t>
       </w:r>
       <w:r>
         <w:rPr>
@@ -972,7 +1388,25 @@
           <w:sz w:val="24"/>
           <w:szCs w:val="24"/>
         </w:rPr>
-        <w:t>{{users[0].name_full()}}</w:t>
+        <w:t>{{users[0].</w:t>
+      </w:r>
+      <w:proofErr w:type="spellStart"/>
+      <w:r>
+        <w:rPr>
+          <w:rFonts w:ascii="Times New Roman" w:hAnsi="Times New Roman"/>
+          <w:sz w:val="24"/>
+          <w:szCs w:val="24"/>
+        </w:rPr>
+        <w:t>name_full</w:t>
+      </w:r>
+      <w:proofErr w:type="spellEnd"/>
+      <w:r>
+        <w:rPr>
+          <w:rFonts w:ascii="Times New Roman" w:hAnsi="Times New Roman"/>
+          <w:sz w:val="24"/>
+          <w:szCs w:val="24"/>
+        </w:rPr>
+        <w:t>()}}</w:t>
       </w:r>
     </w:p>
     <w:p>

</xml_diff>